<commit_message>
docs(f4): agregar apartado de metodologia de estratificacion (aporte Cesar C1)
</commit_message>
<xml_diff>
--- a/docs/f4_s04_evaluacion_entregable_grupo6.docx
+++ b/docs/f4_s04_evaluacion_entregable_grupo6.docx
@@ -5220,6 +5220,19 @@
         <w:t>4. Cómo aporta al relato: Las conclusiones extraídas sobre las jornadas tradicionales (diurna y vespertina) mantienen una alta confiabilidad analítica debido a su bajísima tasa de imputación.</w:t>
       </w:r>
     </w:p>
+    <w:p>
+      <w:pPr>
+        <w:pStyle w:val="Heading1"/>
+      </w:pPr>
+      <w:r>
+        <w:t>Borrador Fase 4: Metodología de Estratificación (César)</w:t>
+      </w:r>
+    </w:p>
+    <w:p>
+      <w:r>
+        <w:t>Para evaluar si la diferencia de duración entre jornadas persiste al controlar por área de conocimiento —el procedimiento estándar para detectar confusión y la paradoja de Simpson—, se aplicó agregacion_anidada (desarrollada en la Fase 3) sobre cada combinación área-jornada, implementada en src/estratificacion.py (estratificar_por_area). La función compara el orden de las jornadas extremas (la de menor y la de mayor duración mediana) observado en el conjunto completo contra el mismo orden dentro de cada área, señalando como "áreas invertidas" aquellas donde ese orden cambia.</w:t>
+      </w:r>
+    </w:p>
     <w:sectPr>
       <w:footerReference w:type="default" r:id="rId9"/>
       <w:pgSz w:w="12240" w:h="15840"/>

</xml_diff>

<commit_message>
docs(f4): agregar sesgo de seleccion, alcance y supuestos (aporte Cesar C3 y C5)
</commit_message>
<xml_diff>
--- a/docs/f4_s04_evaluacion_entregable_grupo6.docx
+++ b/docs/f4_s04_evaluacion_entregable_grupo6.docx
@@ -5233,6 +5233,24 @@
         <w:t>Para evaluar si la diferencia de duración entre jornadas persiste al controlar por área de conocimiento —el procedimiento estándar para detectar confusión y la paradoja de Simpson—, se aplicó agregacion_anidada (desarrollada en la Fase 3) sobre cada combinación área-jornada, implementada en src/estratificacion.py (estratificar_por_area). La función compara el orden de las jornadas extremas (la de menor y la de mayor duración mediana) observado en el conjunto completo contra el mismo orden dentro de cada área, señalando como "áreas invertidas" aquellas donde ese orden cambia.</w:t>
       </w:r>
     </w:p>
+    <w:p>
+      <w:pPr>
+        <w:pStyle w:val="Heading1"/>
+      </w:pPr>
+      <w:r>
+        <w:t>Borrador Fase 4: Sesgo, Alcance y Supuestos (César)</w:t>
+      </w:r>
+    </w:p>
+    <w:p>
+      <w:r>
+        <w:t>Sesgo de Selección: Es importante advertir la presencia de un sesgo de selección inherente al conjunto de datos utilizado, ya que el análisis se restringe exclusivamente a la población de estudiantes que lograron titularse. Al no contar con información sobre los estudiantes que abandonaron sus estudios (deserción académica), los resultados sobre la duración de las carreras podrían estar subestimando el tiempo real promedio que invierte la totalidad de los alumnos que ingresan. Las conclusiones obtenidas reflejan únicamente la trayectoria de los casos de éxito académico, ignorando las dinámicas de aquellos que no completan el plan de estudios.</w:t>
+      </w:r>
+    </w:p>
+    <w:p>
+      <w:r>
+        <w:t>Alcance, Restricciones y Supuestos: El alcance de este estudio se limita al análisis exploratorio y descriptivo de los tiempos de titulación por jornada y área de conocimiento, asumiendo que los registros proporcionados en el dataset son precisos y no contienen errores sistemáticos de digitación. Entre las restricciones principales destaca la ausencia de variables socioeconómicas y demográficas (como situación laboral durante el estudio, edad o nivel de ingresos) que podrían actuar como variables de confusión subyacentes explicando las diferencias entre jornadas. Por lo tanto, se asume que las diferencias observadas responden principalmente a las características de los programas y al perfil general de los estudiantes de cada jornada, aunque no se pueden establecer relaciones de causalidad definitivas sin incluir dichos factores externos.</w:t>
+      </w:r>
+    </w:p>
     <w:sectPr>
       <w:footerReference w:type="default" r:id="rId9"/>
       <w:pgSz w:w="12240" w:h="15840"/>

</xml_diff>

<commit_message>
docs(f4): corregir figuras a 3 y aplicar titulos declarativos (feedback Cesar)
</commit_message>
<xml_diff>
--- a/docs/f4_s04_evaluacion_entregable_grupo6.docx
+++ b/docs/f4_s04_evaluacion_entregable_grupo6.docx
@@ -2803,63 +2803,7 @@
         <w:pStyle w:val="Heading3"/>
       </w:pPr>
       <w:r>
-        <w:t>Figura 1: Distribución de la duración total</w:t>
-      </w:r>
-    </w:p>
-    <w:p>
-      <w:r>
-        <w:t>1. Qué muestra: La distribución empírica de la duración total de las carreras presenta un claro sesgo hacia la derecha, alejándose de una distribución normal.</w:t>
-      </w:r>
-    </w:p>
-    <w:p>
-      <w:r>
-        <w:t>2. Qué se infiere: La mayor concentración de casos se observa a partir del décimo semestre, marcando la pauta habitual de titulación en el sistema.</w:t>
-      </w:r>
-    </w:p>
-    <w:p>
-      <w:r>
-        <w:t>3. Qué límite tiene: La mediana de graduación general se establece por sobre la duración teórica estándar de la mayoría de las carreras de pregrado.</w:t>
-      </w:r>
-    </w:p>
-    <w:p>
-      <w:r>
-        <w:t>4. Cómo aporta al relato: Los valores atípicos superiores indican un subgrupo minoritario pero significativo que extiende sus estudios muy por encima del promedio institucional.</w:t>
-      </w:r>
-    </w:p>
-    <w:p>
-      <w:pPr>
-        <w:pStyle w:val="Heading3"/>
-      </w:pPr>
-      <w:r>
-        <w:t>Figura 2: Tamaño de grupos por área</w:t>
-      </w:r>
-    </w:p>
-    <w:p>
-      <w:r>
-        <w:t>1. Qué muestra: Existe una marcada asimetría en el volumen de titulados según las distintas áreas de conocimiento.</w:t>
-      </w:r>
-    </w:p>
-    <w:p>
-      <w:r>
-        <w:t>2. Qué se infiere: Las áreas principales concentran la abrumadora mayoría de las observaciones del dataset, dictando el comportamiento de las métricas globales.</w:t>
-      </w:r>
-    </w:p>
-    <w:p>
-      <w:r>
-        <w:t>3. Qué límite tiene: Esta disparidad en los tamaños de muestra (n) exige precaución al comparar directamente las métricas de tendencia central entre áreas.</w:t>
-      </w:r>
-    </w:p>
-    <w:p>
-      <w:r>
-        <w:t>4. Cómo aporta al relato: Las áreas con menor representación estadística son más susceptibles a presentar fluctuaciones o verse afectadas por valores extremos.</w:t>
-      </w:r>
-    </w:p>
-    <w:p>
-      <w:pPr>
-        <w:pStyle w:val="Heading3"/>
-      </w:pPr>
-      <w:r>
-        <w:t>Figura 3: Duración mediana por jornada</w:t>
+        <w:t>Figura 1: La duración mediana de la jornada diurna supera en 4 semestres a la vespertina</w:t>
       </w:r>
     </w:p>
     <w:p>
@@ -2887,7 +2831,7 @@
         <w:pStyle w:val="Heading3"/>
       </w:pPr>
       <w:r>
-        <w:t>Figura 4: Dispersión y variabilidad por jornada</w:t>
+        <w:t>Figura 2: La jornada vespertina concentra sus titulaciones con menor dispersión que la diurna</w:t>
       </w:r>
     </w:p>
     <w:p>
@@ -2915,7 +2859,7 @@
         <w:pStyle w:val="Heading3"/>
       </w:pPr>
       <w:r>
-        <w:t>Figura 5: Paneles de estratificación por área de conocimiento</w:t>
+        <w:t>Figura 3: La brecha de duración entre jornadas se mantiene constante al estratificar por área</w:t>
       </w:r>
     </w:p>
     <w:p>
@@ -2936,34 +2880,6 @@
     <w:p>
       <w:r>
         <w:t>4. Cómo aporta al relato: Las áreas con un bajo volumen de observaciones (n) en régimen vespertino obligan a interpretar sus respectivas medianas exclusivamente como referencias, tal como indica la métrica de soporte.</w:t>
-      </w:r>
-    </w:p>
-    <w:p>
-      <w:pPr>
-        <w:pStyle w:val="Heading3"/>
-      </w:pPr>
-      <w:r>
-        <w:t>Figura 6: Trazabilidad e imputación según jornada</w:t>
-      </w:r>
-    </w:p>
-    <w:p>
-      <w:r>
-        <w:t>1. Qué muestra: El análisis de trazabilidad de los datos revela que la necesidad de imputar el año de ingreso no es homogénea entre las distintas jornadas.</w:t>
-      </w:r>
-    </w:p>
-    <w:p>
-      <w:r>
-        <w:t>2. Qué se infiere: Las modalidades a distancia o no tradicionales concentran de manera desproporcionada la mayor cantidad de registros con datos imputados.</w:t>
-      </w:r>
-    </w:p>
-    <w:p>
-      <w:r>
-        <w:t>3. Qué límite tiene: Este sesgo en la calidad de origen del dato introduce una variable de confusión metodológica al intentar comparar rigurosamente todas las categorías.</w:t>
-      </w:r>
-    </w:p>
-    <w:p>
-      <w:r>
-        <w:t>4. Cómo aporta al relato: Las conclusiones extraídas sobre las jornadas tradicionales (diurna y vespertina) mantienen una alta confiabilidad analítica debido a su bajísima tasa de imputación.</w:t>
       </w:r>
     </w:p>
     <w:p>

</xml_diff>

<commit_message>
docs(f4): agregar enlace de la presentacion audiovisual
</commit_message>
<xml_diff>
--- a/docs/f4_s04_evaluacion_entregable_grupo6.docx
+++ b/docs/f4_s04_evaluacion_entregable_grupo6.docx
@@ -2637,6 +2637,11 @@
     </w:p>
     <w:p>
       <w:r>
+        <w:t>Enlace a la grabación: https://drive.google.com/file/d/19imknUpEKtICtm5lLIm27KWAh4BodapC/view?usp=sharing</w:t>
+      </w:r>
+    </w:p>
+    <w:p>
+      <w:r>
         <w:t>En cumplimiento de los requerimientos de la Fase 4, el equipo grabó una presentación audiovisual profesional de 7 minutos y 15 segundos en la herramienta Canvas Studio institucional. La presentación cuenta con la participación activa y visible de los cuatro integrantes, distribuyendo equitativamente los contenidos técnicos:</w:t>
       </w:r>
     </w:p>

</xml_diff>